<commit_message>
Update Date across All information
</commit_message>
<xml_diff>
--- a/public/Eric_Dominic_Momo_Resume.docx
+++ b/public/Eric_Dominic_Momo_Resume.docx
@@ -176,7 +176,7 @@
           <w:b/>
           <w:sz w:val="22"/>
         </w:rPr>
-        <w:t>Loan Monitoring and Financial Management System | May 2026 – Sept 2026</w:t>
+        <w:t>Loan Monitoring and Financial Management System | June 2026 – August 2026</w:t>
         <w:br/>
       </w:r>
       <w:r>
@@ -234,7 +234,7 @@
           <w:b/>
           <w:sz w:val="22"/>
         </w:rPr>
-        <w:t>On-the-Job Trainee (IT Admin Assistant &amp; Web Development) | Feb 2026 – April 2026</w:t>
+        <w:t>On-the-Job Trainee (IT Admin Assistant &amp; Web Development) | February 2026 – May 2026</w:t>
         <w:br/>
       </w:r>
       <w:r>

</xml_diff>